<commit_message>
okeb motion-brief: complete transcription of FILED-EXAMPLE-motion-brief (fb-w0vj.1)
Adds the certificate of mailing's full signature block and mailing-list
line breaks, and the exemplar's apostrophe in the title. fb diff --content:
G0 PASS (4 pages, letter); G2 residuals are template-driven (caption, page
numbers, signature punctuation).
</commit_message>
<xml_diff>
--- a/courts/tenth-circuit/oklahoma/federal/bankruptcy-eastern-district/motion-brief/usage/OUTPUT-motion-brief.docx
+++ b/courts/tenth-circuit/oklahoma/federal/bankruptcy-eastern-district/motion-brief/usage/OUTPUT-motion-brief.docx
@@ -504,7 +504,23 @@
         <w:pStyle w:val="BodyText"/>
       </w:pPr>
       <w:r>
-        <w:t xml:space="preserve">Russell and Alisha Brooks, 1011 Mattox Lane, Sallisaw, OK 74955</w:t>
+        <w:t xml:space="preserve">Russell and Alisha Brooks</w:t>
+      </w:r>
+    </w:p>
+    <w:p>
+      <w:pPr>
+        <w:pStyle w:val="BodyText"/>
+      </w:pPr>
+      <w:r>
+        <w:t xml:space="preserve">1011 Mattox Lane</w:t>
+      </w:r>
+    </w:p>
+    <w:p>
+      <w:pPr>
+        <w:pStyle w:val="BodyText"/>
+      </w:pPr>
+      <w:r>
+        <w:t xml:space="preserve">Sallisaw, OK 74955</w:t>
       </w:r>
     </w:p>
     <w:p>
@@ -520,10 +536,73 @@
     <w:p>
       <w:pPr>
         <w:pStyle w:val="SigBlock"/>
+        <w:keepNext/>
         <w:spacing w:before="96"/>
       </w:pPr>
       <w:r>
         <w:t xml:space="preserve">William Mark Bonney, Trustee OBA #12221</w:t>
+      </w:r>
+    </w:p>
+    <w:p>
+      <w:pPr>
+        <w:pStyle w:val="SigBlock"/>
+        <w:keepNext/>
+      </w:pPr>
+      <w:r>
+        <w:t xml:space="preserve">Jacob R. Parker, OBA #32848</w:t>
+      </w:r>
+    </w:p>
+    <w:p>
+      <w:pPr>
+        <w:pStyle w:val="SigBlock"/>
+        <w:keepNext/>
+      </w:pPr>
+      <w:r>
+        <w:t xml:space="preserve">Office of the Standing Chapter 13 Trustee</w:t>
+      </w:r>
+    </w:p>
+    <w:p>
+      <w:pPr>
+        <w:pStyle w:val="SigBlock"/>
+        <w:keepNext/>
+      </w:pPr>
+      <w:r>
+        <w:t xml:space="preserve">P.O. Box 1548</w:t>
+      </w:r>
+    </w:p>
+    <w:p>
+      <w:pPr>
+        <w:pStyle w:val="SigBlock"/>
+        <w:keepNext/>
+      </w:pPr>
+      <w:r>
+        <w:t xml:space="preserve">Muskogee, OK 74402-1548</w:t>
+      </w:r>
+    </w:p>
+    <w:p>
+      <w:pPr>
+        <w:pStyle w:val="SigBlock"/>
+        <w:keepNext/>
+      </w:pPr>
+      <w:r>
+        <w:t xml:space="preserve">Tele: (918)683-3840</w:t>
+      </w:r>
+    </w:p>
+    <w:p>
+      <w:pPr>
+        <w:pStyle w:val="SigBlock"/>
+        <w:keepNext/>
+      </w:pPr>
+      <w:r>
+        <w:t xml:space="preserve">Fax: (918)683-3302</w:t>
+      </w:r>
+    </w:p>
+    <w:p>
+      <w:pPr>
+        <w:pStyle w:val="SigBlock"/>
+      </w:pPr>
+      <w:r>
+        <w:t xml:space="preserve">trustee@edok13.com</w:t>
       </w:r>
     </w:p>
     <w:sectPr>

</xml_diff>